<commit_message>
modificacion archivos tags y agregacion personalizada de cada card
</commit_message>
<xml_diff>
--- a/Backend/src/templates/qas/FOR Acta QA HOTSPOTS.docx
+++ b/Backend/src/templates/qas/FOR Acta QA HOTSPOTS.docx
@@ -38,558 +38,551 @@
           <w:lang w:val="es-CO"/>
         </w:rPr>
         <w:t>Visita Número:</w:t>
-      </w:r>
-      <w:r>
-        <w:rPr>
-          <w:rFonts w:ascii="Arial" w:hAnsi="Arial" w:cs="Arial"/>
-          <w:b/>
-          <w:lang w:val="es-CO"/>
-        </w:rPr>
         <w:tab/>
-      </w:r>
-      <w:r>
-        <w:rPr>
-          <w:rFonts w:ascii="Arial" w:hAnsi="Arial" w:cs="Arial"/>
-          <w:b/>
-          <w:lang w:val="es-CO"/>
-        </w:rPr>
+        <w:t>{visita_numero}</w:t>
+      </w:r>
+      <w:r>
+        <w:rPr>
+          <w:rFonts w:ascii="Arial" w:hAnsi="Arial" w:cs="Arial"/>
+          <w:b/>
+          <w:lang w:val="es-CO"/>
+        </w:rPr>
+      </w:r>
+      <w:r>
+        <w:rPr>
+          <w:rFonts w:ascii="Arial" w:hAnsi="Arial" w:cs="Arial"/>
+          <w:b/>
+          <w:lang w:val="es-CO"/>
+        </w:rPr>
+      </w:r>
+      <w:r>
+        <w:rPr>
+          <w:rFonts w:ascii="Arial" w:hAnsi="Arial" w:cs="Arial"/>
+          <w:b/>
+          <w:lang w:val="es-CO"/>
+        </w:rPr>
+      </w:r>
+    </w:p>
+    <w:p>
+      <w:pPr>
+        <w:rPr>
+          <w:rFonts w:ascii="Arial" w:hAnsi="Arial" w:cs="Arial"/>
+          <w:b/>
+          <w:lang w:val="es-CO"/>
+        </w:rPr>
+      </w:pPr>
+      <w:r>
+        <w:rPr>
+          <w:rFonts w:ascii="Arial" w:hAnsi="Arial" w:cs="Arial"/>
+          <w:b/>
+          <w:lang w:val="es-CO"/>
+        </w:rPr>
+        <w:t>Fecha Ejecución:</w:t>
         <w:tab/>
-      </w:r>
-      <w:r>
-        <w:rPr>
-          <w:rFonts w:ascii="Arial" w:hAnsi="Arial" w:cs="Arial"/>
-          <w:b/>
-          <w:lang w:val="es-CO"/>
-        </w:rPr>
+        <w:t>{fecha_ejecucion}</w:t>
+      </w:r>
+      <w:r>
+        <w:rPr>
+          <w:rFonts w:ascii="Arial" w:hAnsi="Arial" w:cs="Arial"/>
+          <w:b/>
+          <w:lang w:val="es-CO"/>
+        </w:rPr>
+      </w:r>
+      <w:r>
+        <w:rPr>
+          <w:rFonts w:ascii="Arial" w:hAnsi="Arial" w:cs="Arial"/>
+          <w:b/>
+          <w:lang w:val="es-CO"/>
+        </w:rPr>
+      </w:r>
+    </w:p>
+    <w:p>
+      <w:pPr>
+        <w:rPr>
+          <w:rFonts w:ascii="Arial" w:hAnsi="Arial" w:cs="Arial"/>
+          <w:b/>
+          <w:lang w:val="es-CO"/>
+        </w:rPr>
+      </w:pPr>
+      <w:r>
+        <w:rPr>
+          <w:rFonts w:ascii="Arial" w:hAnsi="Arial" w:cs="Arial"/>
+          <w:b/>
+          <w:lang w:val="es-CO"/>
+        </w:rPr>
+        <w:t>Hora Inicio:</w:t>
         <w:tab/>
-      </w:r>
-    </w:p>
-    <w:p>
-      <w:pPr>
-        <w:rPr>
-          <w:rFonts w:ascii="Arial" w:hAnsi="Arial" w:cs="Arial"/>
-          <w:b/>
-          <w:lang w:val="es-CO"/>
-        </w:rPr>
-      </w:pPr>
-      <w:r>
-        <w:rPr>
-          <w:rFonts w:ascii="Arial" w:hAnsi="Arial" w:cs="Arial"/>
-          <w:b/>
-          <w:lang w:val="es-CO"/>
-        </w:rPr>
-        <w:t>Fecha Ejecución:</w:t>
-      </w:r>
-      <w:r>
-        <w:rPr>
-          <w:rFonts w:ascii="Arial" w:hAnsi="Arial" w:cs="Arial"/>
-          <w:b/>
-          <w:lang w:val="es-CO"/>
-        </w:rPr>
+        <w:t>{hora_inicio}</w:t>
+      </w:r>
+      <w:r>
+        <w:rPr>
+          <w:rFonts w:ascii="Arial" w:hAnsi="Arial" w:cs="Arial"/>
+          <w:b/>
+          <w:lang w:val="es-CO"/>
+        </w:rPr>
+      </w:r>
+      <w:r>
+        <w:rPr>
+          <w:rFonts w:ascii="Arial" w:hAnsi="Arial" w:cs="Arial"/>
+          <w:b/>
+          <w:lang w:val="es-CO"/>
+        </w:rPr>
+      </w:r>
+      <w:r>
+        <w:rPr>
+          <w:rFonts w:ascii="Arial" w:hAnsi="Arial" w:cs="Arial"/>
+          <w:b/>
+          <w:lang w:val="es-CO"/>
+        </w:rPr>
+      </w:r>
+    </w:p>
+    <w:p>
+      <w:pPr>
+        <w:rPr>
+          <w:rFonts w:ascii="Arial" w:hAnsi="Arial" w:cs="Arial"/>
+          <w:b/>
+          <w:lang w:val="es-CO"/>
+        </w:rPr>
+      </w:pPr>
+      <w:r>
+        <w:rPr>
+          <w:rFonts w:ascii="Arial" w:hAnsi="Arial" w:cs="Arial"/>
+          <w:b/>
+          <w:lang w:val="es-CO"/>
+        </w:rPr>
+        <w:t>Tiempo Transporte:</w:t>
         <w:tab/>
-      </w:r>
-      <w:r>
-        <w:rPr>
-          <w:rFonts w:ascii="Arial" w:hAnsi="Arial" w:cs="Arial"/>
-          <w:b/>
-          <w:lang w:val="es-CO"/>
-        </w:rPr>
+        <w:t>{tiempo_transporte}</w:t>
+      </w:r>
+      <w:r>
+        <w:rPr>
+          <w:rFonts w:ascii="Arial" w:hAnsi="Arial" w:cs="Arial"/>
+          <w:b/>
+          <w:lang w:val="es-CO"/>
+        </w:rPr>
+      </w:r>
+      <w:r>
+        <w:rPr>
+          <w:rFonts w:ascii="Arial" w:hAnsi="Arial" w:cs="Arial"/>
+          <w:b/>
+          <w:lang w:val="es-CO"/>
+        </w:rPr>
+      </w:r>
+    </w:p>
+    <w:p>
+      <w:pPr>
+        <w:rPr>
+          <w:rFonts w:ascii="Arial" w:hAnsi="Arial" w:cs="Arial"/>
+          <w:b/>
+          <w:lang w:val="es-CO"/>
+        </w:rPr>
+      </w:pPr>
+      <w:r>
+        <w:rPr>
+          <w:rFonts w:ascii="Arial" w:hAnsi="Arial" w:cs="Arial"/>
+          <w:b/>
+          <w:lang w:val="es-CO"/>
+        </w:rPr>
+        <w:t>Tiempo Antesala:</w:t>
         <w:tab/>
-      </w:r>
-    </w:p>
-    <w:p>
-      <w:pPr>
-        <w:rPr>
-          <w:rFonts w:ascii="Arial" w:hAnsi="Arial" w:cs="Arial"/>
-          <w:b/>
-          <w:lang w:val="es-CO"/>
-        </w:rPr>
-      </w:pPr>
-      <w:r>
-        <w:rPr>
-          <w:rFonts w:ascii="Arial" w:hAnsi="Arial" w:cs="Arial"/>
-          <w:b/>
-          <w:lang w:val="es-CO"/>
-        </w:rPr>
-        <w:t>Hora Inicio:</w:t>
-      </w:r>
-      <w:r>
-        <w:rPr>
-          <w:rFonts w:ascii="Arial" w:hAnsi="Arial" w:cs="Arial"/>
-          <w:b/>
-          <w:lang w:val="es-CO"/>
-        </w:rPr>
+        <w:t>{tiempo_antesala}</w:t>
+      </w:r>
+      <w:r>
+        <w:rPr>
+          <w:rFonts w:ascii="Arial" w:hAnsi="Arial" w:cs="Arial"/>
+          <w:b/>
+          <w:lang w:val="es-CO"/>
+        </w:rPr>
+      </w:r>
+      <w:r>
+        <w:rPr>
+          <w:rFonts w:ascii="Arial" w:hAnsi="Arial" w:cs="Arial"/>
+          <w:b/>
+          <w:lang w:val="es-CO"/>
+        </w:rPr>
+      </w:r>
+    </w:p>
+    <w:p>
+      <w:pPr>
+        <w:rPr>
+          <w:rFonts w:ascii="Arial" w:hAnsi="Arial" w:cs="Arial"/>
+          <w:b/>
+          <w:lang w:val="es-CO"/>
+        </w:rPr>
+      </w:pPr>
+      <w:r>
+        <w:rPr>
+          <w:rFonts w:ascii="Arial" w:hAnsi="Arial" w:cs="Arial"/>
+          <w:b/>
+          <w:lang w:val="es-CO"/>
+        </w:rPr>
+        <w:t>Tiempo Ejecución:</w:t>
         <w:tab/>
-      </w:r>
-      <w:r>
-        <w:rPr>
-          <w:rFonts w:ascii="Arial" w:hAnsi="Arial" w:cs="Arial"/>
-          <w:b/>
-          <w:lang w:val="es-CO"/>
-        </w:rPr>
+        <w:t>{tiempo_ejecucion}</w:t>
+      </w:r>
+      <w:r>
+        <w:rPr>
+          <w:rFonts w:ascii="Arial" w:hAnsi="Arial" w:cs="Arial"/>
+          <w:b/>
+          <w:lang w:val="es-CO"/>
+        </w:rPr>
+      </w:r>
+      <w:r>
+        <w:rPr>
+          <w:rFonts w:ascii="Arial" w:hAnsi="Arial" w:cs="Arial"/>
+          <w:b/>
+          <w:lang w:val="es-CO"/>
+        </w:rPr>
+      </w:r>
+    </w:p>
+    <w:p>
+      <w:pPr>
+        <w:rPr>
+          <w:rFonts w:ascii="Arial" w:hAnsi="Arial" w:cs="Arial"/>
+          <w:b/>
+          <w:lang w:val="es-CO"/>
+        </w:rPr>
+      </w:pPr>
+      <w:r>
+        <w:rPr>
+          <w:rFonts w:ascii="Arial" w:hAnsi="Arial" w:cs="Arial"/>
+          <w:b/>
+          <w:lang w:val="es-CO"/>
+        </w:rPr>
+        <w:t>Espera Claro:</w:t>
         <w:tab/>
-      </w:r>
-      <w:r>
-        <w:rPr>
-          <w:rFonts w:ascii="Arial" w:hAnsi="Arial" w:cs="Arial"/>
-          <w:b/>
-          <w:lang w:val="es-CO"/>
-        </w:rPr>
+        <w:t>{tiempo_espera_claro}</w:t>
+      </w:r>
+      <w:r>
+        <w:rPr>
+          <w:rFonts w:ascii="Arial" w:hAnsi="Arial" w:cs="Arial"/>
+          <w:b/>
+          <w:lang w:val="es-CO"/>
+        </w:rPr>
+      </w:r>
+      <w:r>
+        <w:rPr>
+          <w:rFonts w:ascii="Arial" w:hAnsi="Arial" w:cs="Arial"/>
+          <w:b/>
+          <w:lang w:val="es-CO"/>
+        </w:rPr>
+      </w:r>
+      <w:r>
+        <w:rPr>
+          <w:rFonts w:ascii="Arial" w:hAnsi="Arial" w:cs="Arial"/>
+          <w:b/>
+          <w:lang w:val="es-CO"/>
+        </w:rPr>
+      </w:r>
+      <w:r>
+        <w:rPr>
+          <w:rFonts w:ascii="Arial" w:hAnsi="Arial" w:cs="Arial"/>
+          <w:b/>
+          <w:lang w:val="es-CO"/>
+        </w:rPr>
+      </w:r>
+    </w:p>
+    <w:p>
+      <w:pPr>
+        <w:rPr>
+          <w:rFonts w:ascii="Arial" w:hAnsi="Arial" w:cs="Arial"/>
+          <w:b/>
+          <w:lang w:val="es-CO"/>
+        </w:rPr>
+      </w:pPr>
+      <w:r>
+        <w:rPr>
+          <w:rFonts w:ascii="Arial" w:hAnsi="Arial" w:cs="Arial"/>
+          <w:b/>
+          <w:lang w:val="es-CO"/>
+        </w:rPr>
+        <w:t>Hora Salida:</w:t>
         <w:tab/>
-      </w:r>
-    </w:p>
-    <w:p>
-      <w:pPr>
-        <w:rPr>
-          <w:rFonts w:ascii="Arial" w:hAnsi="Arial" w:cs="Arial"/>
-          <w:b/>
-          <w:lang w:val="es-CO"/>
-        </w:rPr>
-      </w:pPr>
-      <w:r>
-        <w:rPr>
-          <w:rFonts w:ascii="Arial" w:hAnsi="Arial" w:cs="Arial"/>
-          <w:b/>
-          <w:lang w:val="es-CO"/>
-        </w:rPr>
-        <w:t>Tiempo Transporte:</w:t>
-      </w:r>
-      <w:r>
-        <w:rPr>
-          <w:rFonts w:ascii="Arial" w:hAnsi="Arial" w:cs="Arial"/>
-          <w:b/>
-          <w:lang w:val="es-CO"/>
-        </w:rPr>
+        <w:t>{hora_salida}</w:t>
+      </w:r>
+      <w:r>
+        <w:rPr>
+          <w:rFonts w:ascii="Arial" w:hAnsi="Arial" w:cs="Arial"/>
+          <w:b/>
+          <w:lang w:val="es-CO"/>
+        </w:rPr>
+      </w:r>
+      <w:r>
+        <w:rPr>
+          <w:rFonts w:ascii="Arial" w:hAnsi="Arial" w:cs="Arial"/>
+          <w:b/>
+          <w:lang w:val="es-CO"/>
+        </w:rPr>
+      </w:r>
+      <w:r>
+        <w:rPr>
+          <w:rFonts w:ascii="Arial" w:hAnsi="Arial" w:cs="Arial"/>
+          <w:b/>
+          <w:lang w:val="es-CO"/>
+        </w:rPr>
+      </w:r>
+    </w:p>
+    <w:p>
+      <w:pPr>
+        <w:rPr>
+          <w:rFonts w:ascii="Arial" w:hAnsi="Arial" w:cs="Arial"/>
+          <w:b/>
+          <w:lang w:val="es-CO"/>
+        </w:rPr>
+      </w:pPr>
+    </w:p>
+    <w:p>
+      <w:pPr>
+        <w:rPr>
+          <w:rFonts w:ascii="Arial" w:hAnsi="Arial" w:cs="Arial"/>
+          <w:b/>
+          <w:lang w:val="es-CO"/>
+        </w:rPr>
+      </w:pPr>
+      <w:r>
+        <w:rPr>
+          <w:rFonts w:ascii="Arial" w:hAnsi="Arial" w:cs="Arial"/>
+          <w:b/>
+          <w:lang w:val="es-CO"/>
+        </w:rPr>
+        <w:t>Ing. Outsourcing:</w:t>
         <w:tab/>
-      </w:r>
-      <w:r>
-        <w:rPr>
-          <w:rFonts w:ascii="Arial" w:hAnsi="Arial" w:cs="Arial"/>
-          <w:b/>
-          <w:lang w:val="es-CO"/>
-        </w:rPr>
+        <w:t>{ingeniero_outsourcing}</w:t>
+      </w:r>
+      <w:r>
+        <w:rPr>
+          <w:rFonts w:ascii="Arial" w:hAnsi="Arial" w:cs="Arial"/>
+          <w:b/>
+          <w:lang w:val="es-CO"/>
+        </w:rPr>
+      </w:r>
+      <w:r>
+        <w:rPr>
+          <w:rFonts w:ascii="Arial" w:hAnsi="Arial" w:cs="Arial"/>
+          <w:b/>
+          <w:lang w:val="es-CO"/>
+        </w:rPr>
+      </w:r>
+    </w:p>
+    <w:p>
+      <w:pPr>
+        <w:rPr>
+          <w:rFonts w:ascii="Arial" w:hAnsi="Arial" w:cs="Arial"/>
+          <w:b/>
+          <w:lang w:val="es-CO"/>
+        </w:rPr>
+      </w:pPr>
+      <w:r>
+        <w:rPr>
+          <w:rFonts w:ascii="Arial" w:hAnsi="Arial" w:cs="Arial"/>
+          <w:b/>
+          <w:lang w:val="es-CO"/>
+        </w:rPr>
+        <w:t>Multímetro:</w:t>
         <w:tab/>
-      </w:r>
-    </w:p>
-    <w:p>
-      <w:pPr>
-        <w:rPr>
-          <w:rFonts w:ascii="Arial" w:hAnsi="Arial" w:cs="Arial"/>
-          <w:b/>
-          <w:lang w:val="es-CO"/>
-        </w:rPr>
-      </w:pPr>
-      <w:r>
-        <w:rPr>
-          <w:rFonts w:ascii="Arial" w:hAnsi="Arial" w:cs="Arial"/>
-          <w:b/>
-          <w:lang w:val="es-CO"/>
-        </w:rPr>
-        <w:t>Tiempo Antesala:</w:t>
-      </w:r>
-      <w:r>
-        <w:rPr>
-          <w:rFonts w:ascii="Arial" w:hAnsi="Arial" w:cs="Arial"/>
-          <w:b/>
-          <w:lang w:val="es-CO"/>
-        </w:rPr>
+        <w:t>{multimetro}</w:t>
+      </w:r>
+      <w:r>
+        <w:rPr>
+          <w:rFonts w:ascii="Arial" w:hAnsi="Arial" w:cs="Arial"/>
+          <w:b/>
+          <w:lang w:val="es-CO"/>
+        </w:rPr>
+      </w:r>
+      <w:r>
+        <w:rPr>
+          <w:rFonts w:ascii="Arial" w:hAnsi="Arial" w:cs="Arial"/>
+          <w:b/>
+          <w:lang w:val="es-CO"/>
+        </w:rPr>
+      </w:r>
+      <w:r>
+        <w:rPr>
+          <w:rFonts w:ascii="Arial" w:hAnsi="Arial" w:cs="Arial"/>
+          <w:b/>
+          <w:lang w:val="es-CO"/>
+        </w:rPr>
+      </w:r>
+    </w:p>
+    <w:p>
+      <w:pPr>
+        <w:rPr>
+          <w:rFonts w:ascii="Arial" w:hAnsi="Arial" w:cs="Arial"/>
+          <w:b/>
+          <w:lang w:val="es-CO"/>
+        </w:rPr>
+      </w:pPr>
+      <w:r>
+        <w:rPr>
+          <w:rFonts w:ascii="Arial" w:hAnsi="Arial" w:cs="Arial"/>
+          <w:b/>
+          <w:lang w:val="es-CO"/>
+        </w:rPr>
+        <w:t>Analizador de BER:</w:t>
         <w:tab/>
-      </w:r>
-      <w:r>
-        <w:rPr>
-          <w:rFonts w:ascii="Arial" w:hAnsi="Arial" w:cs="Arial"/>
-          <w:b/>
-          <w:lang w:val="es-CO"/>
-        </w:rPr>
+        <w:t>{analizador_ber}</w:t>
+      </w:r>
+      <w:r>
+        <w:rPr>
+          <w:rFonts w:ascii="Arial" w:hAnsi="Arial" w:cs="Arial"/>
+          <w:b/>
+          <w:lang w:val="es-CO"/>
+        </w:rPr>
+      </w:r>
+      <w:r>
+        <w:rPr>
+          <w:rFonts w:ascii="Arial" w:hAnsi="Arial" w:cs="Arial"/>
+          <w:b/>
+          <w:lang w:val="es-CO"/>
+        </w:rPr>
+      </w:r>
+    </w:p>
+    <w:p>
+      <w:pPr>
+        <w:rPr>
+          <w:rFonts w:ascii="Arial" w:hAnsi="Arial" w:cs="Arial"/>
+          <w:b/>
+          <w:lang w:val="es-CO"/>
+        </w:rPr>
+      </w:pPr>
+      <w:r>
+        <w:rPr>
+          <w:rFonts w:ascii="Arial" w:hAnsi="Arial" w:cs="Arial"/>
+          <w:b/>
+          <w:lang w:val="es-CO"/>
+        </w:rPr>
+        <w:t>Soporte Claro:</w:t>
         <w:tab/>
-      </w:r>
-    </w:p>
-    <w:p>
-      <w:pPr>
-        <w:rPr>
-          <w:rFonts w:ascii="Arial" w:hAnsi="Arial" w:cs="Arial"/>
-          <w:b/>
-          <w:lang w:val="es-CO"/>
-        </w:rPr>
-      </w:pPr>
-      <w:r>
-        <w:rPr>
-          <w:rFonts w:ascii="Arial" w:hAnsi="Arial" w:cs="Arial"/>
-          <w:b/>
-          <w:lang w:val="es-CO"/>
-        </w:rPr>
-        <w:t>Tiempo Ejecución:</w:t>
-      </w:r>
-      <w:r>
-        <w:rPr>
-          <w:rFonts w:ascii="Arial" w:hAnsi="Arial" w:cs="Arial"/>
-          <w:b/>
-          <w:lang w:val="es-CO"/>
-        </w:rPr>
+        <w:t>{soporte_claro}</w:t>
+      </w:r>
+      <w:r>
+        <w:rPr>
+          <w:rFonts w:ascii="Arial" w:hAnsi="Arial" w:cs="Arial"/>
+          <w:b/>
+          <w:lang w:val="es-CO"/>
+        </w:rPr>
+      </w:r>
+      <w:r>
+        <w:rPr>
+          <w:rFonts w:ascii="Arial" w:hAnsi="Arial" w:cs="Arial"/>
+          <w:b/>
+          <w:lang w:val="es-CO"/>
+        </w:rPr>
+      </w:r>
+      <w:r>
+        <w:rPr>
+          <w:rFonts w:ascii="Arial" w:hAnsi="Arial" w:cs="Arial"/>
+          <w:b/>
+          <w:lang w:val="es-CO"/>
+        </w:rPr>
+      </w:r>
+    </w:p>
+    <w:p>
+      <w:pPr>
+        <w:rPr>
+          <w:rFonts w:ascii="Arial" w:hAnsi="Arial" w:cs="Arial"/>
+          <w:b/>
+          <w:lang w:val="es-CO"/>
+        </w:rPr>
+      </w:pPr>
+      <w:r>
+        <w:rPr>
+          <w:rFonts w:ascii="Arial" w:hAnsi="Arial" w:cs="Arial"/>
+          <w:b/>
+          <w:lang w:val="es-CO"/>
+        </w:rPr>
+        <w:t>Firma el Acta:</w:t>
         <w:tab/>
-      </w:r>
-      <w:r>
-        <w:rPr>
-          <w:rFonts w:ascii="Arial" w:hAnsi="Arial" w:cs="Arial"/>
-          <w:b/>
-          <w:lang w:val="es-CO"/>
-        </w:rPr>
+        <w:t>{firma_acta}</w:t>
+      </w:r>
+      <w:r>
+        <w:rPr>
+          <w:rFonts w:ascii="Arial" w:hAnsi="Arial" w:cs="Arial"/>
+          <w:b/>
+          <w:lang w:val="es-CO"/>
+        </w:rPr>
+      </w:r>
+      <w:r>
+        <w:rPr>
+          <w:rFonts w:ascii="Arial" w:hAnsi="Arial" w:cs="Arial"/>
+          <w:b/>
+          <w:lang w:val="es-CO"/>
+        </w:rPr>
+      </w:r>
+      <w:r>
+        <w:rPr>
+          <w:rFonts w:ascii="Arial" w:hAnsi="Arial" w:cs="Arial"/>
+          <w:b/>
+          <w:lang w:val="es-CO"/>
+        </w:rPr>
+      </w:r>
+    </w:p>
+    <w:p>
+      <w:pPr>
+        <w:rPr>
+          <w:rFonts w:ascii="Arial" w:hAnsi="Arial" w:cs="Arial"/>
+          <w:b/>
+          <w:lang w:val="es-CO"/>
+        </w:rPr>
+      </w:pPr>
+    </w:p>
+    <w:p>
+      <w:pPr>
+        <w:rPr>
+          <w:rFonts w:ascii="Arial" w:hAnsi="Arial" w:cs="Arial"/>
+          <w:b/>
+          <w:lang w:val="es-CO"/>
+        </w:rPr>
+      </w:pPr>
+      <w:r>
+        <w:rPr>
+          <w:rFonts w:ascii="Arial" w:hAnsi="Arial" w:cs="Arial"/>
+          <w:b/>
+          <w:lang w:val="es-CO"/>
+        </w:rPr>
+        <w:t>Caso Seguimiento:</w:t>
         <w:tab/>
-      </w:r>
-    </w:p>
-    <w:p>
-      <w:pPr>
-        <w:rPr>
-          <w:rFonts w:ascii="Arial" w:hAnsi="Arial" w:cs="Arial"/>
-          <w:b/>
-          <w:lang w:val="es-CO"/>
-        </w:rPr>
-      </w:pPr>
-      <w:r>
-        <w:rPr>
-          <w:rFonts w:ascii="Arial" w:hAnsi="Arial" w:cs="Arial"/>
-          <w:b/>
-          <w:lang w:val="es-CO"/>
-        </w:rPr>
-        <w:t>Espera Claro</w:t>
-      </w:r>
-      <w:r>
-        <w:rPr>
-          <w:rFonts w:ascii="Arial" w:hAnsi="Arial" w:cs="Arial"/>
-          <w:b/>
-          <w:lang w:val="es-CO"/>
-        </w:rPr>
-        <w:t>:</w:t>
-      </w:r>
-      <w:r>
-        <w:rPr>
-          <w:rFonts w:ascii="Arial" w:hAnsi="Arial" w:cs="Arial"/>
-          <w:b/>
-          <w:lang w:val="es-CO"/>
-        </w:rPr>
+        <w:t>{caso_seguimiento}</w:t>
+      </w:r>
+      <w:r>
+        <w:rPr>
+          <w:rFonts w:ascii="Arial" w:hAnsi="Arial" w:cs="Arial"/>
+          <w:b/>
+          <w:lang w:val="es-CO"/>
+        </w:rPr>
+      </w:r>
+      <w:r>
+        <w:rPr>
+          <w:rFonts w:ascii="Arial" w:hAnsi="Arial" w:cs="Arial"/>
+          <w:b/>
+          <w:lang w:val="es-CO"/>
+        </w:rPr>
+      </w:r>
+    </w:p>
+    <w:p>
+      <w:pPr>
+        <w:rPr>
+          <w:rFonts w:ascii="Arial" w:hAnsi="Arial" w:cs="Arial"/>
+          <w:b/>
+          <w:lang w:val="es-CO"/>
+        </w:rPr>
+      </w:pPr>
+      <w:r>
+        <w:rPr>
+          <w:rFonts w:ascii="Arial" w:hAnsi="Arial" w:cs="Arial"/>
+          <w:b/>
+          <w:lang w:val="es-CO"/>
+        </w:rPr>
+        <w:t>Problemas en Instalación:</w:t>
         <w:tab/>
-      </w:r>
-      <w:r>
-        <w:rPr>
-          <w:rFonts w:ascii="Arial" w:hAnsi="Arial" w:cs="Arial"/>
-          <w:b/>
-          <w:lang w:val="es-CO"/>
-        </w:rPr>
-        <w:tab/>
-      </w:r>
-      <w:r>
-        <w:rPr>
-          <w:rFonts w:ascii="Arial" w:hAnsi="Arial" w:cs="Arial"/>
-          <w:b/>
-          <w:lang w:val="es-CO"/>
-        </w:rPr>
-        <w:tab/>
-      </w:r>
-    </w:p>
-    <w:p>
-      <w:pPr>
-        <w:rPr>
-          <w:rFonts w:ascii="Arial" w:hAnsi="Arial" w:cs="Arial"/>
-          <w:b/>
-          <w:lang w:val="es-CO"/>
-        </w:rPr>
-      </w:pPr>
-      <w:r>
-        <w:rPr>
-          <w:rFonts w:ascii="Arial" w:hAnsi="Arial" w:cs="Arial"/>
-          <w:b/>
-          <w:lang w:val="es-CO"/>
-        </w:rPr>
-        <w:t>Hora Salida:</w:t>
-      </w:r>
-      <w:r>
-        <w:rPr>
-          <w:rFonts w:ascii="Arial" w:hAnsi="Arial" w:cs="Arial"/>
-          <w:b/>
-          <w:lang w:val="es-CO"/>
-        </w:rPr>
-        <w:tab/>
-      </w:r>
-      <w:r>
-        <w:rPr>
-          <w:rFonts w:ascii="Arial" w:hAnsi="Arial" w:cs="Arial"/>
-          <w:b/>
-          <w:lang w:val="es-CO"/>
-        </w:rPr>
-        <w:tab/>
-      </w:r>
-      <w:r>
-        <w:rPr>
-          <w:rFonts w:ascii="Arial" w:hAnsi="Arial" w:cs="Arial"/>
-          <w:b/>
-          <w:lang w:val="es-CO"/>
-        </w:rPr>
-        <w:tab/>
-      </w:r>
-    </w:p>
-    <w:p>
-      <w:pPr>
-        <w:rPr>
-          <w:rFonts w:ascii="Arial" w:hAnsi="Arial" w:cs="Arial"/>
-          <w:b/>
-          <w:lang w:val="es-CO"/>
-        </w:rPr>
-      </w:pPr>
-    </w:p>
-    <w:p>
-      <w:pPr>
-        <w:rPr>
-          <w:rFonts w:ascii="Arial" w:hAnsi="Arial" w:cs="Arial"/>
-          <w:b/>
-          <w:lang w:val="es-CO"/>
-        </w:rPr>
-      </w:pPr>
-      <w:r>
-        <w:rPr>
-          <w:rFonts w:ascii="Arial" w:hAnsi="Arial" w:cs="Arial"/>
-          <w:b/>
-          <w:lang w:val="es-CO"/>
-        </w:rPr>
-        <w:t>Ing. Outsourcing:</w:t>
-      </w:r>
-      <w:r>
-        <w:rPr>
-          <w:rFonts w:ascii="Arial" w:hAnsi="Arial" w:cs="Arial"/>
-          <w:b/>
-          <w:lang w:val="es-CO"/>
-        </w:rPr>
-        <w:tab/>
-      </w:r>
-      <w:r>
-        <w:rPr>
-          <w:rFonts w:ascii="Arial" w:hAnsi="Arial" w:cs="Arial"/>
-          <w:b/>
-          <w:lang w:val="es-CO"/>
-        </w:rPr>
-        <w:tab/>
-      </w:r>
-    </w:p>
-    <w:p>
-      <w:pPr>
-        <w:rPr>
-          <w:rFonts w:ascii="Arial" w:hAnsi="Arial" w:cs="Arial"/>
-          <w:b/>
-          <w:lang w:val="es-CO"/>
-        </w:rPr>
-      </w:pPr>
-      <w:r>
-        <w:rPr>
-          <w:rFonts w:ascii="Arial" w:hAnsi="Arial" w:cs="Arial"/>
-          <w:b/>
-          <w:lang w:val="es-CO"/>
-        </w:rPr>
-        <w:t>Multímetro:</w:t>
-      </w:r>
-      <w:r>
-        <w:rPr>
-          <w:rFonts w:ascii="Arial" w:hAnsi="Arial" w:cs="Arial"/>
-          <w:b/>
-          <w:lang w:val="es-CO"/>
-        </w:rPr>
-        <w:tab/>
-      </w:r>
-      <w:r>
-        <w:rPr>
-          <w:rFonts w:ascii="Arial" w:hAnsi="Arial" w:cs="Arial"/>
-          <w:b/>
-          <w:lang w:val="es-CO"/>
-        </w:rPr>
-        <w:tab/>
-      </w:r>
-      <w:r>
-        <w:rPr>
-          <w:rFonts w:ascii="Arial" w:hAnsi="Arial" w:cs="Arial"/>
-          <w:b/>
-          <w:lang w:val="es-CO"/>
-        </w:rPr>
-        <w:tab/>
-      </w:r>
-    </w:p>
-    <w:p>
-      <w:pPr>
-        <w:rPr>
-          <w:rFonts w:ascii="Arial" w:hAnsi="Arial" w:cs="Arial"/>
-          <w:b/>
-          <w:lang w:val="es-CO"/>
-        </w:rPr>
-      </w:pPr>
-      <w:r>
-        <w:rPr>
-          <w:rFonts w:ascii="Arial" w:hAnsi="Arial" w:cs="Arial"/>
-          <w:b/>
-          <w:lang w:val="es-CO"/>
-        </w:rPr>
-        <w:t>Analizador de BER:</w:t>
-      </w:r>
-      <w:r>
-        <w:rPr>
-          <w:rFonts w:ascii="Arial" w:hAnsi="Arial" w:cs="Arial"/>
-          <w:b/>
-          <w:lang w:val="es-CO"/>
-        </w:rPr>
-        <w:tab/>
-      </w:r>
-      <w:r>
-        <w:rPr>
-          <w:rFonts w:ascii="Arial" w:hAnsi="Arial" w:cs="Arial"/>
-          <w:b/>
-          <w:lang w:val="es-CO"/>
-        </w:rPr>
-        <w:tab/>
-      </w:r>
-    </w:p>
-    <w:p>
-      <w:pPr>
-        <w:rPr>
-          <w:rFonts w:ascii="Arial" w:hAnsi="Arial" w:cs="Arial"/>
-          <w:b/>
-          <w:lang w:val="es-CO"/>
-        </w:rPr>
-      </w:pPr>
-      <w:r>
-        <w:rPr>
-          <w:rFonts w:ascii="Arial" w:hAnsi="Arial" w:cs="Arial"/>
-          <w:b/>
-          <w:lang w:val="es-CO"/>
-        </w:rPr>
-        <w:t>Soporte Claro</w:t>
-      </w:r>
-      <w:r>
-        <w:rPr>
-          <w:rFonts w:ascii="Arial" w:hAnsi="Arial" w:cs="Arial"/>
-          <w:b/>
-          <w:lang w:val="es-CO"/>
-        </w:rPr>
-        <w:t>:</w:t>
-      </w:r>
-      <w:r>
-        <w:rPr>
-          <w:rFonts w:ascii="Arial" w:hAnsi="Arial" w:cs="Arial"/>
-          <w:b/>
-          <w:lang w:val="es-CO"/>
-        </w:rPr>
-        <w:tab/>
-      </w:r>
-      <w:r>
-        <w:rPr>
-          <w:rFonts w:ascii="Arial" w:hAnsi="Arial" w:cs="Arial"/>
-          <w:b/>
-          <w:lang w:val="es-CO"/>
-        </w:rPr>
-        <w:tab/>
-      </w:r>
-    </w:p>
-    <w:p>
-      <w:pPr>
-        <w:rPr>
-          <w:rFonts w:ascii="Arial" w:hAnsi="Arial" w:cs="Arial"/>
-          <w:b/>
-          <w:lang w:val="es-CO"/>
-        </w:rPr>
-      </w:pPr>
-      <w:r>
-        <w:rPr>
-          <w:rFonts w:ascii="Arial" w:hAnsi="Arial" w:cs="Arial"/>
-          <w:b/>
-          <w:lang w:val="es-CO"/>
-        </w:rPr>
-        <w:t>Firma el Acta:</w:t>
-      </w:r>
-      <w:r>
-        <w:rPr>
-          <w:rFonts w:ascii="Arial" w:hAnsi="Arial" w:cs="Arial"/>
-          <w:b/>
-          <w:lang w:val="es-CO"/>
-        </w:rPr>
-        <w:tab/>
-      </w:r>
-      <w:r>
-        <w:rPr>
-          <w:rFonts w:ascii="Arial" w:hAnsi="Arial" w:cs="Arial"/>
-          <w:b/>
-          <w:lang w:val="es-CO"/>
-        </w:rPr>
-        <w:tab/>
-      </w:r>
-      <w:r>
-        <w:rPr>
-          <w:rFonts w:ascii="Arial" w:hAnsi="Arial" w:cs="Arial"/>
-          <w:b/>
-          <w:lang w:val="es-CO"/>
-        </w:rPr>
-        <w:tab/>
-      </w:r>
-    </w:p>
-    <w:p>
-      <w:pPr>
-        <w:rPr>
-          <w:rFonts w:ascii="Arial" w:hAnsi="Arial" w:cs="Arial"/>
-          <w:b/>
-          <w:lang w:val="es-CO"/>
-        </w:rPr>
-      </w:pPr>
-    </w:p>
-    <w:p>
-      <w:pPr>
-        <w:rPr>
-          <w:rFonts w:ascii="Arial" w:hAnsi="Arial" w:cs="Arial"/>
-          <w:b/>
-          <w:lang w:val="es-CO"/>
-        </w:rPr>
-      </w:pPr>
-      <w:r>
-        <w:rPr>
-          <w:rFonts w:ascii="Arial" w:hAnsi="Arial" w:cs="Arial"/>
-          <w:b/>
-          <w:lang w:val="es-CO"/>
-        </w:rPr>
-        <w:t>Caso Seguimiento:</w:t>
-      </w:r>
-      <w:r>
-        <w:rPr>
-          <w:rFonts w:ascii="Arial" w:hAnsi="Arial" w:cs="Arial"/>
-          <w:b/>
-          <w:lang w:val="es-CO"/>
-        </w:rPr>
-        <w:tab/>
-      </w:r>
-      <w:r>
-        <w:rPr>
-          <w:rFonts w:ascii="Arial" w:hAnsi="Arial" w:cs="Arial"/>
-          <w:b/>
-          <w:lang w:val="es-CO"/>
-        </w:rPr>
-        <w:tab/>
-      </w:r>
-    </w:p>
-    <w:p>
-      <w:pPr>
-        <w:rPr>
-          <w:rFonts w:ascii="Arial" w:hAnsi="Arial" w:cs="Arial"/>
-          <w:b/>
-          <w:lang w:val="es-CO"/>
-        </w:rPr>
-      </w:pPr>
-      <w:r>
-        <w:rPr>
-          <w:rFonts w:ascii="Arial" w:hAnsi="Arial" w:cs="Arial"/>
-          <w:b/>
-          <w:lang w:val="es-CO"/>
-        </w:rPr>
-        <w:t>Problemas en Instalación:</w:t>
-      </w:r>
-      <w:r>
-        <w:rPr>
-          <w:rFonts w:ascii="Arial" w:hAnsi="Arial" w:cs="Arial"/>
-          <w:b/>
-          <w:lang w:val="es-CO"/>
-        </w:rPr>
-        <w:tab/>
+        <w:t>{problemas_instalacion}</w:t>
+      </w:r>
+      <w:r>
+        <w:rPr>
+          <w:rFonts w:ascii="Arial" w:hAnsi="Arial" w:cs="Arial"/>
+          <w:b/>
+          <w:lang w:val="es-CO"/>
+        </w:rPr>
       </w:r>
     </w:p>
     <w:p>
@@ -635,23 +628,23 @@
           <w:b/>
           <w:lang w:val="es-CO"/>
         </w:rPr>
+        <w:t>Fase-Neutro:</w:t>
         <w:tab/>
-      </w:r>
-      <w:r>
-        <w:rPr>
-          <w:rFonts w:ascii="Arial" w:hAnsi="Arial" w:cs="Arial"/>
-          <w:b/>
-          <w:lang w:val="es-CO"/>
-        </w:rPr>
-        <w:t>Fase-Neutro:</w:t>
-      </w:r>
-      <w:r>
-        <w:rPr>
-          <w:rFonts w:ascii="Arial" w:hAnsi="Arial" w:cs="Arial"/>
-          <w:b/>
-          <w:lang w:val="es-CO"/>
-        </w:rPr>
-        <w:tab/>
+        <w:t>{fase_neutro}</w:t>
+      </w:r>
+      <w:r>
+        <w:rPr>
+          <w:rFonts w:ascii="Arial" w:hAnsi="Arial" w:cs="Arial"/>
+          <w:b/>
+          <w:lang w:val="es-CO"/>
+        </w:rPr>
+      </w:r>
+      <w:r>
+        <w:rPr>
+          <w:rFonts w:ascii="Arial" w:hAnsi="Arial" w:cs="Arial"/>
+          <w:b/>
+          <w:lang w:val="es-CO"/>
+        </w:rPr>
       </w:r>
     </w:p>
     <w:p>
@@ -671,31 +664,30 @@
           <w:b/>
           <w:lang w:val="es-CO"/>
         </w:rPr>
+        <w:t>Fase-Tierra:</w:t>
         <w:tab/>
-      </w:r>
-      <w:r>
-        <w:rPr>
-          <w:rFonts w:ascii="Arial" w:hAnsi="Arial" w:cs="Arial"/>
-          <w:b/>
-          <w:lang w:val="es-CO"/>
-        </w:rPr>
-        <w:t>Fase-Tierra:</w:t>
-      </w:r>
-      <w:r>
-        <w:rPr>
-          <w:rFonts w:ascii="Arial" w:hAnsi="Arial" w:cs="Arial"/>
-          <w:b/>
-          <w:lang w:val="es-CO"/>
-        </w:rPr>
-        <w:tab/>
-      </w:r>
-      <w:r>
-        <w:rPr>
-          <w:rFonts w:ascii="Arial" w:hAnsi="Arial" w:cs="Arial"/>
-          <w:b/>
-          <w:lang w:val="es-CO"/>
-        </w:rPr>
-        <w:tab/>
+        <w:t>{fase_tierra}</w:t>
+      </w:r>
+      <w:r>
+        <w:rPr>
+          <w:rFonts w:ascii="Arial" w:hAnsi="Arial" w:cs="Arial"/>
+          <w:b/>
+          <w:lang w:val="es-CO"/>
+        </w:rPr>
+      </w:r>
+      <w:r>
+        <w:rPr>
+          <w:rFonts w:ascii="Arial" w:hAnsi="Arial" w:cs="Arial"/>
+          <w:b/>
+          <w:lang w:val="es-CO"/>
+        </w:rPr>
+      </w:r>
+      <w:r>
+        <w:rPr>
+          <w:rFonts w:ascii="Arial" w:hAnsi="Arial" w:cs="Arial"/>
+          <w:b/>
+          <w:lang w:val="es-CO"/>
+        </w:rPr>
       </w:r>
     </w:p>
     <w:p>
@@ -715,92 +707,91 @@
           <w:b/>
           <w:lang w:val="es-CO"/>
         </w:rPr>
+        <w:t>Neutro-Tierra:</w:t>
         <w:tab/>
-      </w:r>
-      <w:r>
-        <w:rPr>
-          <w:rFonts w:ascii="Arial" w:hAnsi="Arial" w:cs="Arial"/>
-          <w:b/>
-          <w:lang w:val="es-CO"/>
-        </w:rPr>
-        <w:t>Neutro-Tierra:</w:t>
-      </w:r>
-      <w:r>
-        <w:rPr>
-          <w:rFonts w:ascii="Arial" w:hAnsi="Arial" w:cs="Arial"/>
-          <w:b/>
-          <w:lang w:val="es-CO"/>
-        </w:rPr>
-        <w:tab/>
-      </w:r>
-    </w:p>
-    <w:p>
-      <w:pPr>
-        <w:rPr>
-          <w:rFonts w:ascii="Arial" w:hAnsi="Arial" w:cs="Arial"/>
-          <w:b/>
-          <w:lang w:val="es-CO"/>
-        </w:rPr>
-      </w:pPr>
-    </w:p>
-    <w:p>
-      <w:pPr>
-        <w:rPr>
-          <w:rFonts w:ascii="Arial" w:hAnsi="Arial" w:cs="Arial"/>
-          <w:b/>
-          <w:lang w:val="es-CO"/>
-        </w:rPr>
-      </w:pPr>
-      <w:r>
-        <w:rPr>
-          <w:rFonts w:ascii="Arial" w:hAnsi="Arial" w:cs="Arial"/>
-          <w:b/>
-          <w:lang w:val="es-CO"/>
-        </w:rPr>
-        <w:t>Lugar de Instalación de Equipos:</w:t>
-      </w:r>
-    </w:p>
-    <w:p>
-      <w:pPr>
-        <w:rPr>
-          <w:rFonts w:ascii="Arial" w:hAnsi="Arial" w:cs="Arial"/>
-          <w:b/>
-          <w:lang w:val="es-CO"/>
-        </w:rPr>
-      </w:pPr>
-    </w:p>
-    <w:p>
-      <w:pPr>
-        <w:rPr>
-          <w:rFonts w:ascii="Arial" w:hAnsi="Arial" w:cs="Arial"/>
-          <w:b/>
-          <w:lang w:val="es-CO"/>
-        </w:rPr>
-      </w:pPr>
-    </w:p>
-    <w:p>
-      <w:pPr>
-        <w:rPr>
-          <w:rFonts w:ascii="Arial" w:hAnsi="Arial" w:cs="Arial"/>
-          <w:b/>
-          <w:lang w:val="es-CO"/>
-        </w:rPr>
-      </w:pPr>
-      <w:r>
-        <w:rPr>
-          <w:rFonts w:ascii="Arial" w:hAnsi="Arial" w:cs="Arial"/>
-          <w:b/>
-          <w:lang w:val="es-CO"/>
-        </w:rPr>
-        <w:t>Observaciones</w:t>
-      </w:r>
-      <w:r>
-        <w:rPr>
-          <w:rFonts w:ascii="Arial" w:hAnsi="Arial" w:cs="Arial"/>
-          <w:b/>
-          <w:lang w:val="es-CO"/>
-        </w:rPr>
-        <w:t>:</w:t>
+        <w:t>{neutro_tierra}</w:t>
+      </w:r>
+      <w:r>
+        <w:rPr>
+          <w:rFonts w:ascii="Arial" w:hAnsi="Arial" w:cs="Arial"/>
+          <w:b/>
+          <w:lang w:val="es-CO"/>
+        </w:rPr>
+      </w:r>
+      <w:r>
+        <w:rPr>
+          <w:rFonts w:ascii="Arial" w:hAnsi="Arial" w:cs="Arial"/>
+          <w:b/>
+          <w:lang w:val="es-CO"/>
+        </w:rPr>
+      </w:r>
+    </w:p>
+    <w:p>
+      <w:pPr>
+        <w:rPr>
+          <w:rFonts w:ascii="Arial" w:hAnsi="Arial" w:cs="Arial"/>
+          <w:b/>
+          <w:lang w:val="es-CO"/>
+        </w:rPr>
+      </w:pPr>
+    </w:p>
+    <w:p>
+      <w:pPr>
+        <w:rPr>
+          <w:rFonts w:ascii="Arial" w:hAnsi="Arial" w:cs="Arial"/>
+          <w:b/>
+          <w:lang w:val="es-CO"/>
+        </w:rPr>
+      </w:pPr>
+      <w:r>
+        <w:rPr>
+          <w:rFonts w:ascii="Arial" w:hAnsi="Arial" w:cs="Arial"/>
+          <w:b/>
+          <w:lang w:val="es-CO"/>
+        </w:rPr>
+        <w:t>Lugar de Instalación de Equipos: {lugar_instalacion}</w:t>
+      </w:r>
+    </w:p>
+    <w:p>
+      <w:pPr>
+        <w:rPr>
+          <w:rFonts w:ascii="Arial" w:hAnsi="Arial" w:cs="Arial"/>
+          <w:b/>
+          <w:lang w:val="es-CO"/>
+        </w:rPr>
+      </w:pPr>
+    </w:p>
+    <w:p>
+      <w:pPr>
+        <w:rPr>
+          <w:rFonts w:ascii="Arial" w:hAnsi="Arial" w:cs="Arial"/>
+          <w:b/>
+          <w:lang w:val="es-CO"/>
+        </w:rPr>
+      </w:pPr>
+    </w:p>
+    <w:p>
+      <w:pPr>
+        <w:rPr>
+          <w:rFonts w:ascii="Arial" w:hAnsi="Arial" w:cs="Arial"/>
+          <w:b/>
+          <w:lang w:val="es-CO"/>
+        </w:rPr>
+      </w:pPr>
+      <w:r>
+        <w:rPr>
+          <w:rFonts w:ascii="Arial" w:hAnsi="Arial" w:cs="Arial"/>
+          <w:b/>
+          <w:lang w:val="es-CO"/>
+        </w:rPr>
+        <w:t>Observaciones: {observaciones}</w:t>
+      </w:r>
+      <w:r>
+        <w:rPr>
+          <w:rFonts w:ascii="Arial" w:hAnsi="Arial" w:cs="Arial"/>
+          <w:b/>
+          <w:lang w:val="es-CO"/>
+        </w:rPr>
       </w:r>
     </w:p>
     <w:p>
@@ -820,7 +811,7 @@
           <w:color w:val="A6A6A6" w:themeColor="background1" w:themeShade="A6"/>
           <w:lang w:val="es-CO"/>
         </w:rPr>
-        <w:t>&lt;Documentar observaciones&gt;</w:t>
+        <w:t>{observaciones_pruebas}</w:t>
       </w:r>
     </w:p>
     <w:p>
@@ -1025,13 +1016,9 @@
             <w:tcW w:w="1689" w:type="dxa"/>
           </w:tcPr>
           <w:p>
-            <w:pPr>
-              <w:rPr>
-                <w:rFonts w:ascii="Arial" w:hAnsi="Arial" w:cs="Arial"/>
-                <w:b/>
-                <w:lang w:val="es-CO"/>
-              </w:rPr>
-            </w:pPr>
+            <w:r>
+              <w:t>{equipo_instalado_1_tipo}</w:t>
+            </w:r>
           </w:p>
         </w:tc>
         <w:tc>
@@ -1039,13 +1026,9 @@
             <w:tcW w:w="1113" w:type="dxa"/>
           </w:tcPr>
           <w:p>
-            <w:pPr>
-              <w:rPr>
-                <w:rFonts w:ascii="Arial" w:hAnsi="Arial" w:cs="Arial"/>
-                <w:b/>
-                <w:lang w:val="es-CO"/>
-              </w:rPr>
-            </w:pPr>
+            <w:r>
+              <w:t>{equipo_instalado_1_marca}</w:t>
+            </w:r>
           </w:p>
         </w:tc>
         <w:tc>
@@ -1053,13 +1036,9 @@
             <w:tcW w:w="1559" w:type="dxa"/>
           </w:tcPr>
           <w:p>
-            <w:pPr>
-              <w:rPr>
-                <w:rFonts w:ascii="Arial" w:hAnsi="Arial" w:cs="Arial"/>
-                <w:b/>
-                <w:lang w:val="es-CO"/>
-              </w:rPr>
-            </w:pPr>
+            <w:r>
+              <w:t>{equipo_instalado_1_modelo}</w:t>
+            </w:r>
           </w:p>
         </w:tc>
         <w:tc>
@@ -1067,13 +1046,9 @@
             <w:tcW w:w="1701" w:type="dxa"/>
           </w:tcPr>
           <w:p>
-            <w:pPr>
-              <w:rPr>
-                <w:rFonts w:ascii="Arial" w:hAnsi="Arial" w:cs="Arial"/>
-                <w:b/>
-                <w:lang w:val="es-CO"/>
-              </w:rPr>
-            </w:pPr>
+            <w:r>
+              <w:t>{equipo_instalado_1_serial}</w:t>
+            </w:r>
           </w:p>
         </w:tc>
         <w:tc>
@@ -1081,13 +1056,9 @@
             <w:tcW w:w="2384" w:type="dxa"/>
           </w:tcPr>
           <w:p>
-            <w:pPr>
-              <w:rPr>
-                <w:rFonts w:ascii="Arial" w:hAnsi="Arial" w:cs="Arial"/>
-                <w:b/>
-                <w:lang w:val="es-CO"/>
-              </w:rPr>
-            </w:pPr>
+            <w:r>
+              <w:t>{equipo_instalado_1_placa}</w:t>
+            </w:r>
           </w:p>
         </w:tc>
       </w:tr>
@@ -1097,13 +1068,9 @@
             <w:tcW w:w="1689" w:type="dxa"/>
           </w:tcPr>
           <w:p>
-            <w:pPr>
-              <w:rPr>
-                <w:rFonts w:ascii="Arial" w:hAnsi="Arial" w:cs="Arial"/>
-                <w:b/>
-                <w:lang w:val="es-CO"/>
-              </w:rPr>
-            </w:pPr>
+            <w:r>
+              <w:t>{equipo_instalado_2_tipo}</w:t>
+            </w:r>
           </w:p>
         </w:tc>
         <w:tc>
@@ -1111,13 +1078,9 @@
             <w:tcW w:w="1113" w:type="dxa"/>
           </w:tcPr>
           <w:p>
-            <w:pPr>
-              <w:rPr>
-                <w:rFonts w:ascii="Arial" w:hAnsi="Arial" w:cs="Arial"/>
-                <w:b/>
-                <w:lang w:val="es-CO"/>
-              </w:rPr>
-            </w:pPr>
+            <w:r>
+              <w:t>{equipo_instalado_2_marca}</w:t>
+            </w:r>
           </w:p>
         </w:tc>
         <w:tc>
@@ -1125,13 +1088,9 @@
             <w:tcW w:w="1559" w:type="dxa"/>
           </w:tcPr>
           <w:p>
-            <w:pPr>
-              <w:rPr>
-                <w:rFonts w:ascii="Arial" w:hAnsi="Arial" w:cs="Arial"/>
-                <w:b/>
-                <w:lang w:val="es-CO"/>
-              </w:rPr>
-            </w:pPr>
+            <w:r>
+              <w:t>{equipo_instalado_2_modelo}</w:t>
+            </w:r>
           </w:p>
         </w:tc>
         <w:tc>
@@ -1139,13 +1098,9 @@
             <w:tcW w:w="1701" w:type="dxa"/>
           </w:tcPr>
           <w:p>
-            <w:pPr>
-              <w:rPr>
-                <w:rFonts w:ascii="Arial" w:hAnsi="Arial" w:cs="Arial"/>
-                <w:b/>
-                <w:lang w:val="es-CO"/>
-              </w:rPr>
-            </w:pPr>
+            <w:r>
+              <w:t>{equipo_instalado_2_serial}</w:t>
+            </w:r>
           </w:p>
         </w:tc>
         <w:tc>
@@ -1153,13 +1108,9 @@
             <w:tcW w:w="2384" w:type="dxa"/>
           </w:tcPr>
           <w:p>
-            <w:pPr>
-              <w:rPr>
-                <w:rFonts w:ascii="Arial" w:hAnsi="Arial" w:cs="Arial"/>
-                <w:b/>
-                <w:lang w:val="es-CO"/>
-              </w:rPr>
-            </w:pPr>
+            <w:r>
+              <w:t>{equipo_instalado_2_placa}</w:t>
+            </w:r>
           </w:p>
         </w:tc>
       </w:tr>
@@ -1169,13 +1120,9 @@
             <w:tcW w:w="1689" w:type="dxa"/>
           </w:tcPr>
           <w:p>
-            <w:pPr>
-              <w:rPr>
-                <w:rFonts w:ascii="Arial" w:hAnsi="Arial" w:cs="Arial"/>
-                <w:b/>
-                <w:lang w:val="es-CO"/>
-              </w:rPr>
-            </w:pPr>
+            <w:r>
+              <w:t>{equipo_instalado_3_tipo}</w:t>
+            </w:r>
           </w:p>
         </w:tc>
         <w:tc>
@@ -1183,13 +1130,9 @@
             <w:tcW w:w="1113" w:type="dxa"/>
           </w:tcPr>
           <w:p>
-            <w:pPr>
-              <w:rPr>
-                <w:rFonts w:ascii="Arial" w:hAnsi="Arial" w:cs="Arial"/>
-                <w:b/>
-                <w:lang w:val="es-CO"/>
-              </w:rPr>
-            </w:pPr>
+            <w:r>
+              <w:t>{equipo_instalado_3_marca}</w:t>
+            </w:r>
           </w:p>
         </w:tc>
         <w:tc>
@@ -1197,13 +1140,9 @@
             <w:tcW w:w="1559" w:type="dxa"/>
           </w:tcPr>
           <w:p>
-            <w:pPr>
-              <w:rPr>
-                <w:rFonts w:ascii="Arial" w:hAnsi="Arial" w:cs="Arial"/>
-                <w:b/>
-                <w:lang w:val="es-CO"/>
-              </w:rPr>
-            </w:pPr>
+            <w:r>
+              <w:t>{equipo_instalado_3_modelo}</w:t>
+            </w:r>
           </w:p>
         </w:tc>
         <w:tc>
@@ -1211,13 +1150,9 @@
             <w:tcW w:w="1701" w:type="dxa"/>
           </w:tcPr>
           <w:p>
-            <w:pPr>
-              <w:rPr>
-                <w:rFonts w:ascii="Arial" w:hAnsi="Arial" w:cs="Arial"/>
-                <w:b/>
-                <w:lang w:val="es-CO"/>
-              </w:rPr>
-            </w:pPr>
+            <w:r>
+              <w:t>{equipo_instalado_3_serial}</w:t>
+            </w:r>
           </w:p>
         </w:tc>
         <w:tc>
@@ -1225,13 +1160,9 @@
             <w:tcW w:w="2384" w:type="dxa"/>
           </w:tcPr>
           <w:p>
-            <w:pPr>
-              <w:rPr>
-                <w:rFonts w:ascii="Arial" w:hAnsi="Arial" w:cs="Arial"/>
-                <w:b/>
-                <w:lang w:val="es-CO"/>
-              </w:rPr>
-            </w:pPr>
+            <w:r>
+              <w:t>{equipo_instalado_3_placa}</w:t>
+            </w:r>
           </w:p>
         </w:tc>
       </w:tr>
@@ -1241,13 +1172,9 @@
             <w:tcW w:w="1689" w:type="dxa"/>
           </w:tcPr>
           <w:p>
-            <w:pPr>
-              <w:rPr>
-                <w:rFonts w:ascii="Arial" w:hAnsi="Arial" w:cs="Arial"/>
-                <w:b/>
-                <w:lang w:val="es-CO"/>
-              </w:rPr>
-            </w:pPr>
+            <w:r>
+              <w:t>{equipo_instalado_4_tipo}</w:t>
+            </w:r>
           </w:p>
         </w:tc>
         <w:tc>
@@ -1255,13 +1182,9 @@
             <w:tcW w:w="1113" w:type="dxa"/>
           </w:tcPr>
           <w:p>
-            <w:pPr>
-              <w:rPr>
-                <w:rFonts w:ascii="Arial" w:hAnsi="Arial" w:cs="Arial"/>
-                <w:b/>
-                <w:lang w:val="es-CO"/>
-              </w:rPr>
-            </w:pPr>
+            <w:r>
+              <w:t>{equipo_instalado_4_marca}</w:t>
+            </w:r>
           </w:p>
         </w:tc>
         <w:tc>
@@ -1269,13 +1192,9 @@
             <w:tcW w:w="1559" w:type="dxa"/>
           </w:tcPr>
           <w:p>
-            <w:pPr>
-              <w:rPr>
-                <w:rFonts w:ascii="Arial" w:hAnsi="Arial" w:cs="Arial"/>
-                <w:b/>
-                <w:lang w:val="es-CO"/>
-              </w:rPr>
-            </w:pPr>
+            <w:r>
+              <w:t>{equipo_instalado_4_modelo}</w:t>
+            </w:r>
           </w:p>
         </w:tc>
         <w:tc>
@@ -1283,13 +1202,9 @@
             <w:tcW w:w="1701" w:type="dxa"/>
           </w:tcPr>
           <w:p>
-            <w:pPr>
-              <w:rPr>
-                <w:rFonts w:ascii="Arial" w:hAnsi="Arial" w:cs="Arial"/>
-                <w:b/>
-                <w:lang w:val="es-CO"/>
-              </w:rPr>
-            </w:pPr>
+            <w:r>
+              <w:t>{equipo_instalado_4_serial}</w:t>
+            </w:r>
           </w:p>
         </w:tc>
         <w:tc>
@@ -1297,13 +1212,9 @@
             <w:tcW w:w="2384" w:type="dxa"/>
           </w:tcPr>
           <w:p>
-            <w:pPr>
-              <w:rPr>
-                <w:rFonts w:ascii="Arial" w:hAnsi="Arial" w:cs="Arial"/>
-                <w:b/>
-                <w:lang w:val="es-CO"/>
-              </w:rPr>
-            </w:pPr>
+            <w:r>
+              <w:t>{equipo_instalado_4_placa}</w:t>
+            </w:r>
           </w:p>
         </w:tc>
       </w:tr>
@@ -1500,13 +1411,9 @@
             <w:tcW w:w="1689" w:type="dxa"/>
           </w:tcPr>
           <w:p>
-            <w:pPr>
-              <w:rPr>
-                <w:rFonts w:ascii="Arial" w:hAnsi="Arial" w:cs="Arial"/>
-                <w:b/>
-                <w:lang w:val="es-CO"/>
-              </w:rPr>
-            </w:pPr>
+            <w:r>
+              <w:t>{equipo_desinstalado_1_tipo}</w:t>
+            </w:r>
           </w:p>
         </w:tc>
         <w:tc>
@@ -1514,13 +1421,9 @@
             <w:tcW w:w="1113" w:type="dxa"/>
           </w:tcPr>
           <w:p>
-            <w:pPr>
-              <w:rPr>
-                <w:rFonts w:ascii="Arial" w:hAnsi="Arial" w:cs="Arial"/>
-                <w:b/>
-                <w:lang w:val="es-CO"/>
-              </w:rPr>
-            </w:pPr>
+            <w:r>
+              <w:t>{equipo_desinstalado_1_marca}</w:t>
+            </w:r>
           </w:p>
         </w:tc>
         <w:tc>
@@ -1528,13 +1431,9 @@
             <w:tcW w:w="1559" w:type="dxa"/>
           </w:tcPr>
           <w:p>
-            <w:pPr>
-              <w:rPr>
-                <w:rFonts w:ascii="Arial" w:hAnsi="Arial" w:cs="Arial"/>
-                <w:b/>
-                <w:lang w:val="es-CO"/>
-              </w:rPr>
-            </w:pPr>
+            <w:r>
+              <w:t>{equipo_desinstalado_1_modelo}</w:t>
+            </w:r>
           </w:p>
         </w:tc>
         <w:tc>
@@ -1542,13 +1441,9 @@
             <w:tcW w:w="1701" w:type="dxa"/>
           </w:tcPr>
           <w:p>
-            <w:pPr>
-              <w:rPr>
-                <w:rFonts w:ascii="Arial" w:hAnsi="Arial" w:cs="Arial"/>
-                <w:b/>
-                <w:lang w:val="es-CO"/>
-              </w:rPr>
-            </w:pPr>
+            <w:r>
+              <w:t>{equipo_desinstalado_1_serial}</w:t>
+            </w:r>
           </w:p>
         </w:tc>
         <w:tc>
@@ -1556,13 +1451,9 @@
             <w:tcW w:w="2384" w:type="dxa"/>
           </w:tcPr>
           <w:p>
-            <w:pPr>
-              <w:rPr>
-                <w:rFonts w:ascii="Arial" w:hAnsi="Arial" w:cs="Arial"/>
-                <w:b/>
-                <w:lang w:val="es-CO"/>
-              </w:rPr>
-            </w:pPr>
+            <w:r>
+              <w:t>{equipo_desinstalado_1_placa}</w:t>
+            </w:r>
           </w:p>
         </w:tc>
       </w:tr>
@@ -1572,13 +1463,9 @@
             <w:tcW w:w="1689" w:type="dxa"/>
           </w:tcPr>
           <w:p>
-            <w:pPr>
-              <w:rPr>
-                <w:rFonts w:ascii="Arial" w:hAnsi="Arial" w:cs="Arial"/>
-                <w:b/>
-                <w:lang w:val="es-CO"/>
-              </w:rPr>
-            </w:pPr>
+            <w:r>
+              <w:t>{equipo_desinstalado_2_tipo}</w:t>
+            </w:r>
           </w:p>
         </w:tc>
         <w:tc>
@@ -1586,13 +1473,9 @@
             <w:tcW w:w="1113" w:type="dxa"/>
           </w:tcPr>
           <w:p>
-            <w:pPr>
-              <w:rPr>
-                <w:rFonts w:ascii="Arial" w:hAnsi="Arial" w:cs="Arial"/>
-                <w:b/>
-                <w:lang w:val="es-CO"/>
-              </w:rPr>
-            </w:pPr>
+            <w:r>
+              <w:t>{equipo_desinstalado_2_marca}</w:t>
+            </w:r>
           </w:p>
         </w:tc>
         <w:tc>
@@ -1600,13 +1483,9 @@
             <w:tcW w:w="1559" w:type="dxa"/>
           </w:tcPr>
           <w:p>
-            <w:pPr>
-              <w:rPr>
-                <w:rFonts w:ascii="Arial" w:hAnsi="Arial" w:cs="Arial"/>
-                <w:b/>
-                <w:lang w:val="es-CO"/>
-              </w:rPr>
-            </w:pPr>
+            <w:r>
+              <w:t>{equipo_desinstalado_2_modelo}</w:t>
+            </w:r>
           </w:p>
         </w:tc>
         <w:tc>
@@ -1614,13 +1493,9 @@
             <w:tcW w:w="1701" w:type="dxa"/>
           </w:tcPr>
           <w:p>
-            <w:pPr>
-              <w:rPr>
-                <w:rFonts w:ascii="Arial" w:hAnsi="Arial" w:cs="Arial"/>
-                <w:b/>
-                <w:lang w:val="es-CO"/>
-              </w:rPr>
-            </w:pPr>
+            <w:r>
+              <w:t>{equipo_desinstalado_2_serial}</w:t>
+            </w:r>
           </w:p>
         </w:tc>
         <w:tc>
@@ -1628,13 +1503,9 @@
             <w:tcW w:w="2384" w:type="dxa"/>
           </w:tcPr>
           <w:p>
-            <w:pPr>
-              <w:rPr>
-                <w:rFonts w:ascii="Arial" w:hAnsi="Arial" w:cs="Arial"/>
-                <w:b/>
-                <w:lang w:val="es-CO"/>
-              </w:rPr>
-            </w:pPr>
+            <w:r>
+              <w:t>{equipo_desinstalado_2_placa}</w:t>
+            </w:r>
           </w:p>
         </w:tc>
       </w:tr>
@@ -1644,13 +1515,9 @@
             <w:tcW w:w="1689" w:type="dxa"/>
           </w:tcPr>
           <w:p>
-            <w:pPr>
-              <w:rPr>
-                <w:rFonts w:ascii="Arial" w:hAnsi="Arial" w:cs="Arial"/>
-                <w:b/>
-                <w:lang w:val="es-CO"/>
-              </w:rPr>
-            </w:pPr>
+            <w:r>
+              <w:t>{equipo_desinstalado_3_tipo}</w:t>
+            </w:r>
           </w:p>
         </w:tc>
         <w:tc>
@@ -1658,13 +1525,9 @@
             <w:tcW w:w="1113" w:type="dxa"/>
           </w:tcPr>
           <w:p>
-            <w:pPr>
-              <w:rPr>
-                <w:rFonts w:ascii="Arial" w:hAnsi="Arial" w:cs="Arial"/>
-                <w:b/>
-                <w:lang w:val="es-CO"/>
-              </w:rPr>
-            </w:pPr>
+            <w:r>
+              <w:t>{equipo_desinstalado_3_marca}</w:t>
+            </w:r>
           </w:p>
         </w:tc>
         <w:tc>
@@ -1672,13 +1535,9 @@
             <w:tcW w:w="1559" w:type="dxa"/>
           </w:tcPr>
           <w:p>
-            <w:pPr>
-              <w:rPr>
-                <w:rFonts w:ascii="Arial" w:hAnsi="Arial" w:cs="Arial"/>
-                <w:b/>
-                <w:lang w:val="es-CO"/>
-              </w:rPr>
-            </w:pPr>
+            <w:r>
+              <w:t>{equipo_desinstalado_3_modelo}</w:t>
+            </w:r>
           </w:p>
         </w:tc>
         <w:tc>
@@ -1686,13 +1545,9 @@
             <w:tcW w:w="1701" w:type="dxa"/>
           </w:tcPr>
           <w:p>
-            <w:pPr>
-              <w:rPr>
-                <w:rFonts w:ascii="Arial" w:hAnsi="Arial" w:cs="Arial"/>
-                <w:b/>
-                <w:lang w:val="es-CO"/>
-              </w:rPr>
-            </w:pPr>
+            <w:r>
+              <w:t>{equipo_desinstalado_3_serial}</w:t>
+            </w:r>
           </w:p>
         </w:tc>
         <w:tc>
@@ -1700,13 +1555,9 @@
             <w:tcW w:w="2384" w:type="dxa"/>
           </w:tcPr>
           <w:p>
-            <w:pPr>
-              <w:rPr>
-                <w:rFonts w:ascii="Arial" w:hAnsi="Arial" w:cs="Arial"/>
-                <w:b/>
-                <w:lang w:val="es-CO"/>
-              </w:rPr>
-            </w:pPr>
+            <w:r>
+              <w:t>{equipo_desinstalado_3_placa}</w:t>
+            </w:r>
           </w:p>
         </w:tc>
       </w:tr>
@@ -1716,13 +1567,9 @@
             <w:tcW w:w="1689" w:type="dxa"/>
           </w:tcPr>
           <w:p>
-            <w:pPr>
-              <w:rPr>
-                <w:rFonts w:ascii="Arial" w:hAnsi="Arial" w:cs="Arial"/>
-                <w:b/>
-                <w:lang w:val="es-CO"/>
-              </w:rPr>
-            </w:pPr>
+            <w:r>
+              <w:t>{equipo_desinstalado_4_tipo}</w:t>
+            </w:r>
           </w:p>
         </w:tc>
         <w:tc>
@@ -1730,13 +1577,9 @@
             <w:tcW w:w="1113" w:type="dxa"/>
           </w:tcPr>
           <w:p>
-            <w:pPr>
-              <w:rPr>
-                <w:rFonts w:ascii="Arial" w:hAnsi="Arial" w:cs="Arial"/>
-                <w:b/>
-                <w:lang w:val="es-CO"/>
-              </w:rPr>
-            </w:pPr>
+            <w:r>
+              <w:t>{equipo_desinstalado_4_marca}</w:t>
+            </w:r>
           </w:p>
         </w:tc>
         <w:tc>
@@ -1744,13 +1587,9 @@
             <w:tcW w:w="1559" w:type="dxa"/>
           </w:tcPr>
           <w:p>
-            <w:pPr>
-              <w:rPr>
-                <w:rFonts w:ascii="Arial" w:hAnsi="Arial" w:cs="Arial"/>
-                <w:b/>
-                <w:lang w:val="es-CO"/>
-              </w:rPr>
-            </w:pPr>
+            <w:r>
+              <w:t>{equipo_desinstalado_4_modelo}</w:t>
+            </w:r>
           </w:p>
         </w:tc>
         <w:tc>
@@ -1758,13 +1597,9 @@
             <w:tcW w:w="1701" w:type="dxa"/>
           </w:tcPr>
           <w:p>
-            <w:pPr>
-              <w:rPr>
-                <w:rFonts w:ascii="Arial" w:hAnsi="Arial" w:cs="Arial"/>
-                <w:b/>
-                <w:lang w:val="es-CO"/>
-              </w:rPr>
-            </w:pPr>
+            <w:r>
+              <w:t>{equipo_desinstalado_4_serial}</w:t>
+            </w:r>
           </w:p>
         </w:tc>
         <w:tc>
@@ -1772,13 +1607,9 @@
             <w:tcW w:w="2384" w:type="dxa"/>
           </w:tcPr>
           <w:p>
-            <w:pPr>
-              <w:rPr>
-                <w:rFonts w:ascii="Arial" w:hAnsi="Arial" w:cs="Arial"/>
-                <w:b/>
-                <w:lang w:val="es-CO"/>
-              </w:rPr>
-            </w:pPr>
+            <w:r>
+              <w:t>{equipo_desinstalado_4_placa}</w:t>
+            </w:r>
           </w:p>
         </w:tc>
       </w:tr>
@@ -1870,6 +1701,8 @@
           <w:lang w:val="es-CO"/>
         </w:rPr>
         <w:t>Foto antes de la instalación (400x300 pixeles).</w:t>
+        <w:br/>
+        <w:t>{foto_antes_instalacion}</w:t>
       </w:r>
     </w:p>
     <w:p>
@@ -1965,31 +1798,30 @@
           <w:b/>
           <w:lang w:val="es-CO"/>
         </w:rPr>
-        <w:t>Foto después de la Instalación</w:t>
-      </w:r>
-      <w:r>
-        <w:rPr>
-          <w:rFonts w:ascii="Arial" w:hAnsi="Arial" w:cs="Arial"/>
-          <w:b/>
-          <w:lang w:val="es-CO"/>
-        </w:rPr>
-        <w:t xml:space="preserve">, debe incluir UM </w:t>
-      </w:r>
-      <w:r>
-        <w:rPr>
-          <w:rFonts w:ascii="Arial" w:hAnsi="Arial" w:cs="Arial"/>
-          <w:b/>
-          <w:lang w:val="es-CO"/>
-        </w:rPr>
-        <w:t>(Claro o Tercero)</w:t>
-      </w:r>
-      <w:r>
-        <w:rPr>
-          <w:rFonts w:ascii="Arial" w:hAnsi="Arial" w:cs="Arial"/>
-          <w:b/>
-          <w:lang w:val="es-CO"/>
-        </w:rPr>
-        <w:t xml:space="preserve"> (400x300 pixeles).</w:t>
+        <w:t>Foto después de la Instalación, debe incluir UM (Claro o Tercero) (400x300 pixeles).</w:t>
+        <w:br/>
+        <w:t>{foto_despues_instalacion}</w:t>
+      </w:r>
+      <w:r>
+        <w:rPr>
+          <w:rFonts w:ascii="Arial" w:hAnsi="Arial" w:cs="Arial"/>
+          <w:b/>
+          <w:lang w:val="es-CO"/>
+        </w:rPr>
+      </w:r>
+      <w:r>
+        <w:rPr>
+          <w:rFonts w:ascii="Arial" w:hAnsi="Arial" w:cs="Arial"/>
+          <w:b/>
+          <w:lang w:val="es-CO"/>
+        </w:rPr>
+      </w:r>
+      <w:r>
+        <w:rPr>
+          <w:rFonts w:ascii="Arial" w:hAnsi="Arial" w:cs="Arial"/>
+          <w:b/>
+          <w:lang w:val="es-CO"/>
+        </w:rPr>
       </w:r>
     </w:p>
     <w:p>
@@ -2076,32 +1908,30 @@
           <w:b/>
           <w:lang w:val="es-CO"/>
         </w:rPr>
-        <w:br w:type="page"/>
-      </w:r>
-      <w:r>
-        <w:rPr>
-          <w:rFonts w:ascii="Arial" w:hAnsi="Arial" w:cs="Arial"/>
-          <w:b/>
-          <w:lang w:val="es-CO"/>
-        </w:rPr>
-        <w:lastRenderedPageBreak/>
-        <w:t>Foto marquillas</w:t>
-      </w:r>
-      <w:r>
-        <w:rPr>
-          <w:rFonts w:ascii="Arial" w:hAnsi="Arial" w:cs="Arial"/>
-          <w:b/>
-          <w:lang w:val="es-CO"/>
-        </w:rPr>
-        <w:t xml:space="preserve"> completas (Cables y Equipos)</w:t>
-      </w:r>
-      <w:r>
-        <w:rPr>
-          <w:rFonts w:ascii="Arial" w:hAnsi="Arial" w:cs="Arial"/>
-          <w:b/>
-          <w:lang w:val="es-CO"/>
-        </w:rPr>
-        <w:t xml:space="preserve"> (400x300 pixeles).</w:t>
+        <w:t>Foto marquillas completas (Cables y Equipos) (400x300 pixeles).</w:t>
+        <w:br/>
+        <w:t>{foto_marquillas}</w:t>
+      </w:r>
+      <w:r>
+        <w:rPr>
+          <w:rFonts w:ascii="Arial" w:hAnsi="Arial" w:cs="Arial"/>
+          <w:b/>
+          <w:lang w:val="es-CO"/>
+        </w:rPr>
+      </w:r>
+      <w:r>
+        <w:rPr>
+          <w:rFonts w:ascii="Arial" w:hAnsi="Arial" w:cs="Arial"/>
+          <w:b/>
+          <w:lang w:val="es-CO"/>
+        </w:rPr>
+      </w:r>
+      <w:r>
+        <w:rPr>
+          <w:rFonts w:ascii="Arial" w:hAnsi="Arial" w:cs="Arial"/>
+          <w:b/>
+          <w:lang w:val="es-CO"/>
+        </w:rPr>
       </w:r>
     </w:p>
     <w:p>
@@ -2197,23 +2027,23 @@
           <w:b/>
           <w:lang w:val="es-CO"/>
         </w:rPr>
-        <w:t xml:space="preserve">Foto tomas </w:t>
-      </w:r>
-      <w:r>
-        <w:rPr>
-          <w:rFonts w:ascii="Arial" w:hAnsi="Arial" w:cs="Arial"/>
-          <w:b/>
-          <w:lang w:val="es-CO"/>
-        </w:rPr>
-        <w:t>eléctricas (</w:t>
-      </w:r>
-      <w:r>
-        <w:rPr>
-          <w:rFonts w:ascii="Arial" w:hAnsi="Arial" w:cs="Arial"/>
-          <w:b/>
-          <w:lang w:val="es-CO"/>
-        </w:rPr>
-        <w:t>400x300 pixeles).</w:t>
+        <w:t>Foto tomas eléctricas (400x300 pixeles).</w:t>
+        <w:br/>
+        <w:t>{foto_tomas_electricas}</w:t>
+      </w:r>
+      <w:r>
+        <w:rPr>
+          <w:rFonts w:ascii="Arial" w:hAnsi="Arial" w:cs="Arial"/>
+          <w:b/>
+          <w:lang w:val="es-CO"/>
+        </w:rPr>
+      </w:r>
+      <w:r>
+        <w:rPr>
+          <w:rFonts w:ascii="Arial" w:hAnsi="Arial" w:cs="Arial"/>
+          <w:b/>
+          <w:lang w:val="es-CO"/>
+        </w:rPr>
       </w:r>
     </w:p>
     <w:p>
@@ -2319,8 +2149,9 @@
           <w:b/>
           <w:lang w:val="es-CO"/>
         </w:rPr>
-        <w:lastRenderedPageBreak/>
         <w:t>Foto Voltaje [Relación Neutro-Tierra] (400x300 pixeles).</w:t>
+        <w:br/>
+        <w:t>{foto_voltaje}</w:t>
       </w:r>
     </w:p>
     <w:p>
@@ -2509,7 +2340,7 @@
           <w:color w:val="A6A6A6" w:themeColor="background1" w:themeShade="A6"/>
           <w:lang w:val="es-CO"/>
         </w:rPr>
-        <w:t>&lt;Resultado de la prueba de ping&gt;</w:t>
+        <w:t>{ping_central}</w:t>
       </w:r>
     </w:p>
     <w:p>
@@ -2547,7 +2378,7 @@
           <w:color w:val="A6A6A6" w:themeColor="background1" w:themeShade="A6"/>
           <w:lang w:val="es-CO"/>
         </w:rPr>
-        <w:t>&lt;Resultado del trace route&gt;</w:t>
+        <w:t>{traceroute}</w:t>
       </w:r>
     </w:p>
     <w:p>
@@ -2611,6 +2442,8 @@
           <w:lang w:val="es-CO"/>
         </w:rPr>
         <w:t>Evidencia de versión o firmware de los equipos</w:t>
+        <w:br/>
+        <w:t>{firmware_info}</w:t>
       </w:r>
     </w:p>
     <w:p>
@@ -2674,6 +2507,8 @@
           <w:lang w:val="es-CO"/>
         </w:rPr>
         <w:t xml:space="preserve">Evidencia de configuración de equipo Router </w:t>
+        <w:br/>
+        <w:t>{config_router}</w:t>
       </w:r>
     </w:p>
     <w:p>
@@ -3030,7 +2865,7 @@
           <w:color w:val="A6A6A6" w:themeColor="background1" w:themeShade="A6"/>
           <w:lang w:val="es-CO"/>
         </w:rPr>
-        <w:t>&lt;Documentar observaciones&gt;</w:t>
+        <w:t>{observaciones_pruebas}</w:t>
       </w:r>
     </w:p>
     <w:p>
@@ -3207,15 +3042,9 @@
             <w:vAlign w:val="center"/>
           </w:tcPr>
           <w:p>
-            <w:pPr>
-              <w:jc w:val="center"/>
-              <w:rPr>
-                <w:rFonts w:ascii="Arial" w:hAnsi="Arial" w:cs="Arial"/>
-                <w:b/>
-                <w:bCs/>
-                <w:lang w:val="es-CO"/>
-              </w:rPr>
-            </w:pPr>
+            <w:r>
+              <w:t>{conectividad_internet_x_si}</w:t>
+            </w:r>
           </w:p>
         </w:tc>
         <w:tc>
@@ -3268,15 +3097,9 @@
             <w:vAlign w:val="center"/>
           </w:tcPr>
           <w:p>
-            <w:pPr>
-              <w:jc w:val="center"/>
-              <w:rPr>
-                <w:rFonts w:ascii="Arial" w:hAnsi="Arial" w:cs="Arial"/>
-                <w:b/>
-                <w:bCs/>
-                <w:lang w:val="es-CO"/>
-              </w:rPr>
-            </w:pPr>
+            <w:r>
+              <w:t>{conectividad_internet_x_no}</w:t>
+            </w:r>
           </w:p>
         </w:tc>
       </w:tr>
@@ -3464,6 +3287,8 @@
           <w:lang w:val="es-CO"/>
         </w:rPr>
         <w:t>Pantallazo Imagen Evidencia (Incluir)</w:t>
+        <w:br/>
+        <w:t>{foto_evidencia_conectividad_internet}</w:t>
       </w:r>
     </w:p>
     <w:p>
@@ -3551,7 +3376,7 @@
           <w:color w:val="A6A6A6" w:themeColor="background1" w:themeShade="A6"/>
           <w:lang w:val="es-CO"/>
         </w:rPr>
-        <w:t>&lt;Adjuntar la configuración del CPE&gt;</w:t>
+        <w:t>{config_cpe}</w:t>
       </w:r>
     </w:p>
     <w:p>
@@ -3715,7 +3540,9 @@
           <w:bCs/>
           <w:lang w:val="es-CO"/>
         </w:rPr>
-        <w:t xml:space="preserve">Pantallazo </w:t>
+        <w:t>Pantallazo Acta de entrega de servicio</w:t>
+        <w:br/>
+        <w:t>{foto_acta_entrega}</w:t>
       </w:r>
       <w:r>
         <w:rPr>
@@ -3724,7 +3551,6 @@
           <w:bCs/>
           <w:lang w:val="es-CO"/>
         </w:rPr>
-        <w:t>Acta de entrega de servicio</w:t>
       </w:r>
     </w:p>
     <w:p>
@@ -3772,6 +3598,8 @@
           <w:lang w:val="es-CO"/>
         </w:rPr>
         <w:t>OBSERVACIONES</w:t>
+        <w:br/>
+        <w:t>{observaciones_finales}</w:t>
       </w:r>
     </w:p>
     <w:p>
@@ -3818,23 +3646,23 @@
           <w:b/>
           <w:lang w:val="es-CO"/>
         </w:rPr>
-        <w:t xml:space="preserve">PRUEBAS </w:t>
-      </w:r>
-      <w:r>
-        <w:rPr>
-          <w:rFonts w:ascii="Arial" w:hAnsi="Arial" w:cs="Arial"/>
-          <w:b/>
-          <w:lang w:val="es-CO"/>
-        </w:rPr>
-        <w:t>/ DOCUMENTACIÓN ESPECÍFICA SOLICITADA</w:t>
-      </w:r>
-      <w:r>
-        <w:rPr>
-          <w:rFonts w:ascii="Arial" w:hAnsi="Arial" w:cs="Arial"/>
-          <w:b/>
-          <w:lang w:val="es-CO"/>
-        </w:rPr>
-        <w:t xml:space="preserve"> POR CLIENTE</w:t>
+        <w:t>PRUEBAS / DOCUMENTACIÓN ESPECÍFICA SOLICITADA POR CLIENTE</w:t>
+        <w:br/>
+        <w:t>{documentacion_especifica_cliente}</w:t>
+      </w:r>
+      <w:r>
+        <w:rPr>
+          <w:rFonts w:ascii="Arial" w:hAnsi="Arial" w:cs="Arial"/>
+          <w:b/>
+          <w:lang w:val="es-CO"/>
+        </w:rPr>
+      </w:r>
+      <w:r>
+        <w:rPr>
+          <w:rFonts w:ascii="Arial" w:hAnsi="Arial" w:cs="Arial"/>
+          <w:b/>
+          <w:lang w:val="es-CO"/>
+        </w:rPr>
       </w:r>
     </w:p>
     <w:p>

</xml_diff>